<commit_message>
Add SmartPet AI Chatbot documentation
</commit_message>
<xml_diff>
--- a/docs/SmartPet AI Chatbot.docx
+++ b/docs/SmartPet AI Chatbot.docx
@@ -82,6 +82,9 @@
       <w:pPr>
         <w:rPr>
           <w:rFonts w:ascii="Arial" w:hAnsi="Arial" w:cs="Arial"/>
+          <w:sz w:val="24"/>
+          <w:szCs w:val="24"/>
+          <w:u w:val="single"/>
         </w:rPr>
       </w:pPr>
       <w:r>
@@ -89,6 +92,9 @@
           <w:rFonts w:ascii="Arial" w:hAnsi="Arial" w:cs="Arial"/>
           <w:b/>
           <w:bCs/>
+          <w:sz w:val="24"/>
+          <w:szCs w:val="24"/>
+          <w:u w:val="single"/>
         </w:rPr>
         <w:t>Project Overview</w:t>
       </w:r>
@@ -131,6 +137,9 @@
       <w:pPr>
         <w:rPr>
           <w:rFonts w:ascii="Arial" w:hAnsi="Arial" w:cs="Arial"/>
+          <w:sz w:val="26"/>
+          <w:szCs w:val="26"/>
+          <w:u w:val="single"/>
         </w:rPr>
       </w:pPr>
       <w:r>
@@ -138,6 +147,9 @@
           <w:rFonts w:ascii="Arial" w:hAnsi="Arial" w:cs="Arial"/>
           <w:b/>
           <w:bCs/>
+          <w:sz w:val="26"/>
+          <w:szCs w:val="26"/>
+          <w:u w:val="single"/>
         </w:rPr>
         <w:t>Concepts Learned</w:t>
       </w:r>
@@ -405,6 +417,9 @@
       <w:pPr>
         <w:rPr>
           <w:rFonts w:ascii="Arial" w:hAnsi="Arial" w:cs="Arial"/>
+          <w:sz w:val="26"/>
+          <w:szCs w:val="26"/>
+          <w:u w:val="single"/>
         </w:rPr>
       </w:pPr>
       <w:r>
@@ -412,6 +427,9 @@
           <w:rFonts w:ascii="Arial" w:hAnsi="Arial" w:cs="Arial"/>
           <w:b/>
           <w:bCs/>
+          <w:sz w:val="26"/>
+          <w:szCs w:val="26"/>
+          <w:u w:val="single"/>
         </w:rPr>
         <w:lastRenderedPageBreak/>
         <w:t>Tools and Technologies</w:t>
@@ -553,6 +571,9 @@
       <w:pPr>
         <w:rPr>
           <w:rFonts w:ascii="Arial" w:hAnsi="Arial" w:cs="Arial"/>
+          <w:sz w:val="26"/>
+          <w:szCs w:val="26"/>
+          <w:u w:val="single"/>
         </w:rPr>
       </w:pPr>
       <w:r>
@@ -560,6 +581,9 @@
           <w:rFonts w:ascii="Arial" w:hAnsi="Arial" w:cs="Arial"/>
           <w:b/>
           <w:bCs/>
+          <w:sz w:val="26"/>
+          <w:szCs w:val="26"/>
+          <w:u w:val="single"/>
         </w:rPr>
         <w:t>Engineering Practices</w:t>
       </w:r>
@@ -581,6 +605,9 @@
       <w:pPr>
         <w:rPr>
           <w:rFonts w:ascii="Arial" w:hAnsi="Arial" w:cs="Arial"/>
+          <w:sz w:val="26"/>
+          <w:szCs w:val="26"/>
+          <w:u w:val="single"/>
         </w:rPr>
       </w:pPr>
       <w:r>
@@ -588,6 +615,9 @@
           <w:rFonts w:ascii="Arial" w:hAnsi="Arial" w:cs="Arial"/>
           <w:b/>
           <w:bCs/>
+          <w:sz w:val="26"/>
+          <w:szCs w:val="26"/>
+          <w:u w:val="single"/>
         </w:rPr>
         <w:t>Conclusion</w:t>
       </w:r>

</xml_diff>